<commit_message>
refactor: CP_pos 更名 W_w/texture_w + 秩相关并列修正 + 文档全面审计
- 指标更名（2026-08-04）：多字母名无法写进公式、易误读为"聚类突出 CP 的位置
  变体"（实为 Ca+CPa 组合指数）。符号 W_w（下标 w=位置加权，与 Ca,w/CPa,w 同族），
  代码键 texture_w；metrics API 改名并留 cp_pos/CpPosResult 兼容别名，
  生成器/资产目录/JSON 字段/产物文件名全链路同步
- 全部秩相关改并列平均秩：形式对照表写死的 vs_man 三值经逐位复核出自已废
  argsort 口径（-0.888/-0.930/-0.877 → 真值 -0.894/-0.923/-0.883）；
  改为运行时真复算落盘，新增 ca-vs-cpa 配对 bootstrap（Δ=+0.039 CI 含 0，不显著）
- W_w 技术说明 V1.4：评估域如实披露（实证在整片矫正图，未扣 E/H）、
  "0.16~1.0"出处更正为 Dix(2023) p.120、资产清单补全 texture_w_diag
- 位置评分三份文档：删"与 CCP 协作/位置盲区"整章（W_w 自带位置权重、平移
  实测变 10.8%/16.8%，原论证失效）；Spearman 0.888→0.879（并列修正）；
  分档表补人工 90/95 两档（85→90 倒挂，"严格单调"不成立，如实改写）；
  4.7 补披露：仅覆盖支路 0.940 高于取小的 0.879，取小属保守选择
- 公式说明/使用手册：§8.5 重写为 W_w（理论上界 49/3201.33、零标定）、判定默认
  停用、位置评分刻度 ρ0/C0/C1 方案级可调；渲染器 **加粗** 由字面打印改真加粗
- 删除误放安装包 309.5MB 与孤儿 PDF 1.7MB

Co-Authored-By: Claude Opus 5 <noreply@anthropic.com>
</commit_message>
<xml_diff>
--- a/docs/应力斑位置评分_测试集检测报告.docx
+++ b/docs/应力斑位置评分_测试集检测报告.docx
@@ -28,7 +28,7 @@
           <w:color w:val="606060"/>
           <w:sz w:val="18"/>
         </w:rPr>
-        <w:t>2026-07-22　|　算法 GlassApp v1.10.0（位置评分双支路口径）　|　数值与技术说明第六部分同源</w:t>
+        <w:t>2026-07-22　|　算法 GlassApp v1.10.0（位置评分双支路口径）　|　数值与技术说明第五部分同源</w:t>
       </w:r>
     </w:p>
     <w:p>
@@ -144,7 +144,7 @@
           <w:b w:val="0"/>
           <w:sz w:val="21"/>
         </w:rPr>
-        <w:t>打分一致性：位置评分与人工评分秩相关（Spearman）= 0.888；评分范围</w:t>
+        <w:t>打分一致性：位置评分与人工评分秩相关（Spearman，并列取平均秩）= 0.879；</w:t>
       </w:r>
       <w:r>
         <w:br/>
@@ -155,7 +155,7 @@
           <w:b w:val="0"/>
           <w:sz w:val="21"/>
         </w:rPr>
-        <w:t>[0.0, 90.1]，低于 60 分 50 张；八个人工分档的评分均值随人工分</w:t>
+        <w:t>评分范围 [0.0, 90.1]，低于 60 分 50 张。分档均值总体随人工分</w:t>
       </w:r>
       <w:r>
         <w:br/>
@@ -166,7 +166,18 @@
           <w:b w:val="0"/>
           <w:sz w:val="21"/>
         </w:rPr>
-        <w:t>严格单调（下表）。</w:t>
+        <w:t>上升，但**并非逐档严格单调**——人工 90 分档均值低于 85 分档（两档分别</w:t>
+      </w:r>
+      <w:r>
+        <w:br/>
+      </w:r>
+      <w:r>
+        <w:rPr>
+          <w:rFonts w:ascii="Microsoft YaHei" w:hAnsi="Microsoft YaHei" w:eastAsia="微软雅黑"/>
+          <w:b w:val="0"/>
+          <w:sz w:val="21"/>
+        </w:rPr>
+        <w:t>13 片与 17 片，最高两档样本量偏小），如实列于下表。</w:t>
       </w:r>
     </w:p>
     <w:tbl>
@@ -1174,6 +1185,226 @@
           </w:p>
         </w:tc>
       </w:tr>
+      <w:tr>
+        <w:tc>
+          <w:tcPr>
+            <w:tcW w:type="dxa" w:w="1440"/>
+          </w:tcPr>
+          <w:p>
+            <w:pPr>
+              <w:spacing w:after="0"/>
+            </w:pPr>
+            <w:r>
+              <w:rPr>
+                <w:rFonts w:ascii="Microsoft YaHei" w:hAnsi="Microsoft YaHei" w:eastAsia="微软雅黑"/>
+                <w:b w:val="0"/>
+                <w:sz w:val="18"/>
+              </w:rPr>
+              <w:t xml:space="preserve">  90</w:t>
+            </w:r>
+          </w:p>
+        </w:tc>
+        <w:tc>
+          <w:tcPr>
+            <w:tcW w:type="dxa" w:w="1440"/>
+          </w:tcPr>
+          <w:p>
+            <w:pPr>
+              <w:spacing w:after="0"/>
+            </w:pPr>
+            <w:r>
+              <w:rPr>
+                <w:rFonts w:ascii="Microsoft YaHei" w:hAnsi="Microsoft YaHei" w:eastAsia="微软雅黑"/>
+                <w:b w:val="0"/>
+                <w:sz w:val="18"/>
+              </w:rPr>
+              <w:t xml:space="preserve"> 13</w:t>
+            </w:r>
+          </w:p>
+        </w:tc>
+        <w:tc>
+          <w:tcPr>
+            <w:tcW w:type="dxa" w:w="1440"/>
+          </w:tcPr>
+          <w:p>
+            <w:pPr>
+              <w:spacing w:after="0"/>
+            </w:pPr>
+            <w:r>
+              <w:rPr>
+                <w:rFonts w:ascii="Microsoft YaHei" w:hAnsi="Microsoft YaHei" w:eastAsia="微软雅黑"/>
+                <w:b w:val="0"/>
+                <w:sz w:val="18"/>
+              </w:rPr>
+              <w:t xml:space="preserve"> 83.8</w:t>
+            </w:r>
+          </w:p>
+        </w:tc>
+        <w:tc>
+          <w:tcPr>
+            <w:tcW w:type="dxa" w:w="1440"/>
+          </w:tcPr>
+          <w:p>
+            <w:pPr>
+              <w:spacing w:after="0"/>
+            </w:pPr>
+            <w:r>
+              <w:rPr>
+                <w:rFonts w:ascii="Microsoft YaHei" w:hAnsi="Microsoft YaHei" w:eastAsia="微软雅黑"/>
+                <w:b w:val="0"/>
+                <w:sz w:val="18"/>
+              </w:rPr>
+              <w:t>[ 80.3 ,  87.0]</w:t>
+            </w:r>
+          </w:p>
+        </w:tc>
+        <w:tc>
+          <w:tcPr>
+            <w:tcW w:type="dxa" w:w="1440"/>
+          </w:tcPr>
+          <w:p>
+            <w:pPr>
+              <w:spacing w:after="0"/>
+            </w:pPr>
+            <w:r>
+              <w:rPr>
+                <w:rFonts w:ascii="Microsoft YaHei" w:hAnsi="Microsoft YaHei" w:eastAsia="微软雅黑"/>
+                <w:b w:val="0"/>
+                <w:sz w:val="18"/>
+              </w:rPr>
+              <w:t>0.053</w:t>
+            </w:r>
+          </w:p>
+        </w:tc>
+        <w:tc>
+          <w:tcPr>
+            <w:tcW w:type="dxa" w:w="1440"/>
+          </w:tcPr>
+          <w:p>
+            <w:pPr>
+              <w:spacing w:after="0"/>
+            </w:pPr>
+            <w:r>
+              <w:rPr>
+                <w:rFonts w:ascii="Microsoft YaHei" w:hAnsi="Microsoft YaHei" w:eastAsia="微软雅黑"/>
+                <w:b w:val="0"/>
+                <w:sz w:val="18"/>
+              </w:rPr>
+              <w:t>0.044</w:t>
+            </w:r>
+          </w:p>
+        </w:tc>
+      </w:tr>
+      <w:tr>
+        <w:tc>
+          <w:tcPr>
+            <w:tcW w:type="dxa" w:w="1440"/>
+          </w:tcPr>
+          <w:p>
+            <w:pPr>
+              <w:spacing w:after="0"/>
+            </w:pPr>
+            <w:r>
+              <w:rPr>
+                <w:rFonts w:ascii="Microsoft YaHei" w:hAnsi="Microsoft YaHei" w:eastAsia="微软雅黑"/>
+                <w:b w:val="0"/>
+                <w:sz w:val="18"/>
+              </w:rPr>
+              <w:t xml:space="preserve">  95</w:t>
+            </w:r>
+          </w:p>
+        </w:tc>
+        <w:tc>
+          <w:tcPr>
+            <w:tcW w:type="dxa" w:w="1440"/>
+          </w:tcPr>
+          <w:p>
+            <w:pPr>
+              <w:spacing w:after="0"/>
+            </w:pPr>
+            <w:r>
+              <w:rPr>
+                <w:rFonts w:ascii="Microsoft YaHei" w:hAnsi="Microsoft YaHei" w:eastAsia="微软雅黑"/>
+                <w:b w:val="0"/>
+                <w:sz w:val="18"/>
+              </w:rPr>
+              <w:t xml:space="preserve">  2</w:t>
+            </w:r>
+          </w:p>
+        </w:tc>
+        <w:tc>
+          <w:tcPr>
+            <w:tcW w:type="dxa" w:w="1440"/>
+          </w:tcPr>
+          <w:p>
+            <w:pPr>
+              <w:spacing w:after="0"/>
+            </w:pPr>
+            <w:r>
+              <w:rPr>
+                <w:rFonts w:ascii="Microsoft YaHei" w:hAnsi="Microsoft YaHei" w:eastAsia="微软雅黑"/>
+                <w:b w:val="0"/>
+                <w:sz w:val="18"/>
+              </w:rPr>
+              <w:t xml:space="preserve"> 85.9</w:t>
+            </w:r>
+          </w:p>
+        </w:tc>
+        <w:tc>
+          <w:tcPr>
+            <w:tcW w:type="dxa" w:w="1440"/>
+          </w:tcPr>
+          <w:p>
+            <w:pPr>
+              <w:spacing w:after="0"/>
+            </w:pPr>
+            <w:r>
+              <w:rPr>
+                <w:rFonts w:ascii="Microsoft YaHei" w:hAnsi="Microsoft YaHei" w:eastAsia="微软雅黑"/>
+                <w:b w:val="0"/>
+                <w:sz w:val="18"/>
+              </w:rPr>
+              <w:t>[ 84.1 ,  87.8]</w:t>
+            </w:r>
+          </w:p>
+        </w:tc>
+        <w:tc>
+          <w:tcPr>
+            <w:tcW w:type="dxa" w:w="1440"/>
+          </w:tcPr>
+          <w:p>
+            <w:pPr>
+              <w:spacing w:after="0"/>
+            </w:pPr>
+            <w:r>
+              <w:rPr>
+                <w:rFonts w:ascii="Microsoft YaHei" w:hAnsi="Microsoft YaHei" w:eastAsia="微软雅黑"/>
+                <w:b w:val="0"/>
+                <w:sz w:val="18"/>
+              </w:rPr>
+              <w:t>0.046</w:t>
+            </w:r>
+          </w:p>
+        </w:tc>
+        <w:tc>
+          <w:tcPr>
+            <w:tcW w:type="dxa" w:w="1440"/>
+          </w:tcPr>
+          <w:p>
+            <w:pPr>
+              <w:spacing w:after="0"/>
+            </w:pPr>
+            <w:r>
+              <w:rPr>
+                <w:rFonts w:ascii="Microsoft YaHei" w:hAnsi="Microsoft YaHei" w:eastAsia="微软雅黑"/>
+                <w:b w:val="0"/>
+                <w:sz w:val="18"/>
+              </w:rPr>
+              <w:t>0.048</w:t>
+            </w:r>
+          </w:p>
+        </w:tc>
+      </w:tr>
     </w:tbl>
     <w:p>
       <w:pPr>
@@ -1191,7 +1422,19 @@
           <w:color w:val="606060"/>
           <w:sz w:val="18"/>
         </w:rPr>
-        <w:t>列说明：人工=专家分档打分（50~85）；系统参考=图片文件名携带的外部系统参考分，</w:t>
+        <w:t>列说明：人工=专家分档打分（50~95，5 分一档）；系统参考=图片文件名携带的外部</w:t>
+      </w:r>
+      <w:r>
+        <w:br/>
+      </w:r>
+      <w:r>
+        <w:rPr>
+          <w:rFonts w:ascii="Microsoft YaHei" w:hAnsi="Microsoft YaHei" w:eastAsia="微软雅黑"/>
+          <w:b w:val="0"/>
+          <w:color w:val="606060"/>
+          <w:sz w:val="18"/>
+        </w:rPr>
+        <w:t>系统参考分，</w:t>
       </w:r>
       <w:r>
         <w:br/>
@@ -1227,7 +1470,19 @@
           <w:color w:val="606060"/>
           <w:sz w:val="18"/>
         </w:rPr>
-        <w:t>X0.95 为灰度域代理值、CCP 参考值为批内初值——两列同批相对可比。</w:t>
+        <w:t>X0.95 为灰度域代理值（未作灰度—光程差标定），同批相对可比；</w:t>
+      </w:r>
+      <w:r>
+        <w:br/>
+      </w:r>
+      <w:r>
+        <w:rPr>
+          <w:rFonts w:ascii="Microsoft YaHei" w:hAnsi="Microsoft YaHei" w:eastAsia="微软雅黑"/>
+          <w:b w:val="0"/>
+          <w:color w:val="606060"/>
+          <w:sz w:val="18"/>
+        </w:rPr>
+        <w:t>W_w = 位置加权组合纹理指数（越大越差，归一分母为数学上界、零标定）。</w:t>
       </w:r>
     </w:p>
     <w:p>
@@ -1421,7 +1676,7 @@
                 <w:b/>
                 <w:sz w:val="18"/>
               </w:rPr>
-              <w:t>CCP</w:t>
+              <w:t xml:space="preserve"> W_w</w:t>
             </w:r>
           </w:p>
         </w:tc>
@@ -1602,7 +1857,7 @@
                 <w:b w:val="0"/>
                 <w:sz w:val="18"/>
               </w:rPr>
-              <w:t>0.731</w:t>
+              <w:t>0.2572</w:t>
             </w:r>
           </w:p>
         </w:tc>
@@ -1783,7 +2038,7 @@
                 <w:b w:val="0"/>
                 <w:sz w:val="18"/>
               </w:rPr>
-              <w:t>0.776</w:t>
+              <w:t>0.2693</w:t>
             </w:r>
           </w:p>
         </w:tc>
@@ -1964,7 +2219,7 @@
                 <w:b w:val="0"/>
                 <w:sz w:val="18"/>
               </w:rPr>
-              <w:t>0.890</w:t>
+              <w:t>0.2847</w:t>
             </w:r>
           </w:p>
         </w:tc>
@@ -2145,7 +2400,7 @@
                 <w:b w:val="0"/>
                 <w:sz w:val="18"/>
               </w:rPr>
-              <w:t>0.818</w:t>
+              <w:t>0.2760</w:t>
             </w:r>
           </w:p>
         </w:tc>
@@ -2326,7 +2581,7 @@
                 <w:b w:val="0"/>
                 <w:sz w:val="18"/>
               </w:rPr>
-              <w:t>1.035</w:t>
+              <w:t>0.3320</w:t>
             </w:r>
           </w:p>
         </w:tc>
@@ -2507,7 +2762,7 @@
                 <w:b w:val="0"/>
                 <w:sz w:val="18"/>
               </w:rPr>
-              <w:t>1.090</w:t>
+              <w:t>0.3307</w:t>
             </w:r>
           </w:p>
         </w:tc>
@@ -2688,7 +2943,7 @@
                 <w:b w:val="0"/>
                 <w:sz w:val="18"/>
               </w:rPr>
-              <w:t>1.017</w:t>
+              <w:t>0.3213</w:t>
             </w:r>
           </w:p>
         </w:tc>
@@ -2869,7 +3124,7 @@
                 <w:b w:val="0"/>
                 <w:sz w:val="18"/>
               </w:rPr>
-              <w:t>0.930</w:t>
+              <w:t>0.3022</w:t>
             </w:r>
           </w:p>
         </w:tc>
@@ -3050,7 +3305,7 @@
                 <w:b w:val="0"/>
                 <w:sz w:val="18"/>
               </w:rPr>
-              <w:t>1.036</w:t>
+              <w:t>0.3164</w:t>
             </w:r>
           </w:p>
         </w:tc>
@@ -3231,7 +3486,7 @@
                 <w:b w:val="0"/>
                 <w:sz w:val="18"/>
               </w:rPr>
-              <w:t>0.913</w:t>
+              <w:t>0.3039</w:t>
             </w:r>
           </w:p>
         </w:tc>
@@ -3412,7 +3667,7 @@
                 <w:b w:val="0"/>
                 <w:sz w:val="18"/>
               </w:rPr>
-              <w:t>1.027</w:t>
+              <w:t>0.3170</w:t>
             </w:r>
           </w:p>
         </w:tc>
@@ -3593,7 +3848,7 @@
                 <w:b w:val="0"/>
                 <w:sz w:val="18"/>
               </w:rPr>
-              <w:t>0.907</w:t>
+              <w:t>0.3045</w:t>
             </w:r>
           </w:p>
         </w:tc>
@@ -3774,7 +4029,7 @@
                 <w:b w:val="0"/>
                 <w:sz w:val="18"/>
               </w:rPr>
-              <w:t>0.955</w:t>
+              <w:t>0.2989</w:t>
             </w:r>
           </w:p>
         </w:tc>
@@ -3955,7 +4210,7 @@
                 <w:b w:val="0"/>
                 <w:sz w:val="18"/>
               </w:rPr>
-              <w:t>0.892</w:t>
+              <w:t>0.2993</w:t>
             </w:r>
           </w:p>
         </w:tc>
@@ -4136,7 +4391,7 @@
                 <w:b w:val="0"/>
                 <w:sz w:val="18"/>
               </w:rPr>
-              <w:t>0.942</w:t>
+              <w:t>0.3011</w:t>
             </w:r>
           </w:p>
         </w:tc>
@@ -4317,7 +4572,7 @@
                 <w:b w:val="0"/>
                 <w:sz w:val="18"/>
               </w:rPr>
-              <w:t>0.897</w:t>
+              <w:t>0.2942</w:t>
             </w:r>
           </w:p>
         </w:tc>
@@ -4498,7 +4753,7 @@
                 <w:b w:val="0"/>
                 <w:sz w:val="18"/>
               </w:rPr>
-              <w:t>1.272</w:t>
+              <w:t>0.3518</w:t>
             </w:r>
           </w:p>
         </w:tc>
@@ -4680,7 +4935,7 @@
                 <w:b w:val="0"/>
                 <w:sz w:val="18"/>
               </w:rPr>
-              <w:t>1.020</w:t>
+              <w:t>0.3281</w:t>
             </w:r>
           </w:p>
         </w:tc>
@@ -4861,7 +5116,7 @@
                 <w:b w:val="0"/>
                 <w:sz w:val="18"/>
               </w:rPr>
-              <w:t>1.100</w:t>
+              <w:t>0.3633</w:t>
             </w:r>
           </w:p>
         </w:tc>
@@ -5042,7 +5297,7 @@
                 <w:b w:val="0"/>
                 <w:sz w:val="18"/>
               </w:rPr>
-              <w:t>0.969</w:t>
+              <w:t>0.3180</w:t>
             </w:r>
           </w:p>
         </w:tc>
@@ -5223,7 +5478,7 @@
                 <w:b w:val="0"/>
                 <w:sz w:val="18"/>
               </w:rPr>
-              <w:t>0.988</w:t>
+              <w:t>0.3188</w:t>
             </w:r>
           </w:p>
         </w:tc>
@@ -5404,7 +5659,7 @@
                 <w:b w:val="0"/>
                 <w:sz w:val="18"/>
               </w:rPr>
-              <w:t>0.942</w:t>
+              <w:t>0.3050</w:t>
             </w:r>
           </w:p>
         </w:tc>
@@ -5585,7 +5840,7 @@
                 <w:b w:val="0"/>
                 <w:sz w:val="18"/>
               </w:rPr>
-              <w:t>0.957</w:t>
+              <w:t>0.3058</w:t>
             </w:r>
           </w:p>
         </w:tc>
@@ -5766,7 +6021,7 @@
                 <w:b w:val="0"/>
                 <w:sz w:val="18"/>
               </w:rPr>
-              <w:t>0.917</w:t>
+              <w:t>0.3034</w:t>
             </w:r>
           </w:p>
         </w:tc>
@@ -5947,7 +6202,7 @@
                 <w:b w:val="0"/>
                 <w:sz w:val="18"/>
               </w:rPr>
-              <w:t>1.044</w:t>
+              <w:t>0.2967</w:t>
             </w:r>
           </w:p>
         </w:tc>
@@ -6129,7 +6384,7 @@
                 <w:b w:val="0"/>
                 <w:sz w:val="18"/>
               </w:rPr>
-              <w:t>0.929</w:t>
+              <w:t>0.3075</w:t>
             </w:r>
           </w:p>
         </w:tc>
@@ -6310,7 +6565,7 @@
                 <w:b w:val="0"/>
                 <w:sz w:val="18"/>
               </w:rPr>
-              <w:t>1.123</w:t>
+              <w:t>0.3410</w:t>
             </w:r>
           </w:p>
         </w:tc>
@@ -6491,7 +6746,7 @@
                 <w:b w:val="0"/>
                 <w:sz w:val="18"/>
               </w:rPr>
-              <w:t>1.124</w:t>
+              <w:t>0.3753</w:t>
             </w:r>
           </w:p>
         </w:tc>
@@ -6672,7 +6927,7 @@
                 <w:b w:val="0"/>
                 <w:sz w:val="18"/>
               </w:rPr>
-              <w:t>1.100</w:t>
+              <w:t>0.3465</w:t>
             </w:r>
           </w:p>
         </w:tc>
@@ -6853,7 +7108,7 @@
                 <w:b w:val="0"/>
                 <w:sz w:val="18"/>
               </w:rPr>
-              <w:t>1.119</w:t>
+              <w:t>0.3562</w:t>
             </w:r>
           </w:p>
         </w:tc>
@@ -7034,7 +7289,7 @@
                 <w:b w:val="0"/>
                 <w:sz w:val="18"/>
               </w:rPr>
-              <w:t>0.988</w:t>
+              <w:t>0.3259</w:t>
             </w:r>
           </w:p>
         </w:tc>
@@ -7215,7 +7470,7 @@
                 <w:b w:val="0"/>
                 <w:sz w:val="18"/>
               </w:rPr>
-              <w:t>1.019</w:t>
+              <w:t>0.3453</w:t>
             </w:r>
           </w:p>
         </w:tc>
@@ -7396,7 +7651,7 @@
                 <w:b w:val="0"/>
                 <w:sz w:val="18"/>
               </w:rPr>
-              <w:t>1.024</w:t>
+              <w:t>0.3224</w:t>
             </w:r>
           </w:p>
         </w:tc>
@@ -7577,7 +7832,7 @@
                 <w:b w:val="0"/>
                 <w:sz w:val="18"/>
               </w:rPr>
-              <w:t>0.995</w:t>
+              <w:t>0.3337</w:t>
             </w:r>
           </w:p>
         </w:tc>
@@ -7758,7 +8013,7 @@
                 <w:b w:val="0"/>
                 <w:sz w:val="18"/>
               </w:rPr>
-              <w:t>1.054</w:t>
+              <w:t>0.3302</w:t>
             </w:r>
           </w:p>
         </w:tc>
@@ -7939,7 +8194,7 @@
                 <w:b w:val="0"/>
                 <w:sz w:val="18"/>
               </w:rPr>
-              <w:t>1.009</w:t>
+              <w:t>0.3392</w:t>
             </w:r>
           </w:p>
         </w:tc>
@@ -8120,7 +8375,7 @@
                 <w:b w:val="0"/>
                 <w:sz w:val="18"/>
               </w:rPr>
-              <w:t>1.082</w:t>
+              <w:t>0.3464</w:t>
             </w:r>
           </w:p>
         </w:tc>
@@ -8301,7 +8556,7 @@
                 <w:b w:val="0"/>
                 <w:sz w:val="18"/>
               </w:rPr>
-              <w:t>0.997</w:t>
+              <w:t>0.3443</w:t>
             </w:r>
           </w:p>
         </w:tc>
@@ -8482,7 +8737,7 @@
                 <w:b w:val="0"/>
                 <w:sz w:val="18"/>
               </w:rPr>
-              <w:t>1.142</w:t>
+              <w:t>0.3605</w:t>
             </w:r>
           </w:p>
         </w:tc>
@@ -8663,7 +8918,7 @@
                 <w:b w:val="0"/>
                 <w:sz w:val="18"/>
               </w:rPr>
-              <w:t>1.106</w:t>
+              <w:t>0.3651</w:t>
             </w:r>
           </w:p>
         </w:tc>
@@ -8881,7 +9136,7 @@
                 <w:b/>
                 <w:sz w:val="18"/>
               </w:rPr>
-              <w:t>CCP</w:t>
+              <w:t xml:space="preserve"> W_w</w:t>
             </w:r>
           </w:p>
         </w:tc>
@@ -9045,7 +9300,7 @@
                 <w:b w:val="0"/>
                 <w:sz w:val="18"/>
               </w:rPr>
-              <w:t>0.970</w:t>
+              <w:t>0.3321</w:t>
             </w:r>
           </w:p>
         </w:tc>
@@ -9209,7 +9464,7 @@
                 <w:b w:val="0"/>
                 <w:sz w:val="18"/>
               </w:rPr>
-              <w:t>1.031</w:t>
+              <w:t>0.3649</w:t>
             </w:r>
           </w:p>
         </w:tc>
@@ -9373,7 +9628,7 @@
                 <w:b w:val="0"/>
                 <w:sz w:val="18"/>
               </w:rPr>
-              <w:t>0.958</w:t>
+              <w:t>0.3332</w:t>
             </w:r>
           </w:p>
         </w:tc>
@@ -9537,7 +9792,7 @@
                 <w:b w:val="0"/>
                 <w:sz w:val="18"/>
               </w:rPr>
-              <w:t>0.969</w:t>
+              <w:t>0.3302</w:t>
             </w:r>
           </w:p>
         </w:tc>
@@ -9701,7 +9956,7 @@
                 <w:b w:val="0"/>
                 <w:sz w:val="18"/>
               </w:rPr>
-              <w:t>1.162</w:t>
+              <w:t>0.3615</w:t>
             </w:r>
           </w:p>
         </w:tc>
@@ -9865,7 +10120,7 @@
                 <w:b w:val="0"/>
                 <w:sz w:val="18"/>
               </w:rPr>
-              <w:t>1.062</w:t>
+              <w:t>0.3453</w:t>
             </w:r>
           </w:p>
         </w:tc>
@@ -10029,7 +10284,7 @@
                 <w:b w:val="0"/>
                 <w:sz w:val="18"/>
               </w:rPr>
-              <w:t>1.000</w:t>
+              <w:t>0.3446</w:t>
             </w:r>
           </w:p>
         </w:tc>
@@ -10193,7 +10448,7 @@
                 <w:b w:val="0"/>
                 <w:sz w:val="18"/>
               </w:rPr>
-              <w:t>1.008</w:t>
+              <w:t>0.3447</w:t>
             </w:r>
           </w:p>
         </w:tc>
@@ -10357,7 +10612,7 @@
                 <w:b w:val="0"/>
                 <w:sz w:val="18"/>
               </w:rPr>
-              <w:t>0.980</w:t>
+              <w:t>0.3284</w:t>
             </w:r>
           </w:p>
         </w:tc>
@@ -10521,7 +10776,7 @@
                 <w:b w:val="0"/>
                 <w:sz w:val="18"/>
               </w:rPr>
-              <w:t>0.989</w:t>
+              <w:t>0.3204</w:t>
             </w:r>
           </w:p>
         </w:tc>
@@ -10685,7 +10940,7 @@
                 <w:b w:val="0"/>
                 <w:sz w:val="18"/>
               </w:rPr>
-              <w:t>1.078</w:t>
+              <w:t>0.3544</w:t>
             </w:r>
           </w:p>
         </w:tc>
@@ -10849,7 +11104,7 @@
                 <w:b w:val="0"/>
                 <w:sz w:val="18"/>
               </w:rPr>
-              <w:t>0.993</w:t>
+              <w:t>0.3398</w:t>
             </w:r>
           </w:p>
         </w:tc>
@@ -11013,7 +11268,7 @@
                 <w:b w:val="0"/>
                 <w:sz w:val="18"/>
               </w:rPr>
-              <w:t>1.005</w:t>
+              <w:t>0.3367</w:t>
             </w:r>
           </w:p>
         </w:tc>
@@ -11177,7 +11432,7 @@
                 <w:b w:val="0"/>
                 <w:sz w:val="18"/>
               </w:rPr>
-              <w:t>0.928</w:t>
+              <w:t>0.3304</w:t>
             </w:r>
           </w:p>
         </w:tc>
@@ -11341,7 +11596,7 @@
                 <w:b w:val="0"/>
                 <w:sz w:val="18"/>
               </w:rPr>
-              <w:t>0.935</w:t>
+              <w:t>0.3252</w:t>
             </w:r>
           </w:p>
         </w:tc>
@@ -11505,7 +11760,7 @@
                 <w:b w:val="0"/>
                 <w:sz w:val="18"/>
               </w:rPr>
-              <w:t>0.955</w:t>
+              <w:t>0.3400</w:t>
             </w:r>
           </w:p>
         </w:tc>
@@ -11669,7 +11924,7 @@
                 <w:b w:val="0"/>
                 <w:sz w:val="18"/>
               </w:rPr>
-              <w:t>0.939</w:t>
+              <w:t>0.3347</w:t>
             </w:r>
           </w:p>
         </w:tc>
@@ -11833,7 +12088,7 @@
                 <w:b w:val="0"/>
                 <w:sz w:val="18"/>
               </w:rPr>
-              <w:t>0.948</w:t>
+              <w:t>0.3350</w:t>
             </w:r>
           </w:p>
         </w:tc>
@@ -11997,7 +12252,7 @@
                 <w:b w:val="0"/>
                 <w:sz w:val="18"/>
               </w:rPr>
-              <w:t>1.023</w:t>
+              <w:t>0.3520</w:t>
             </w:r>
           </w:p>
         </w:tc>
@@ -12161,7 +12416,7 @@
                 <w:b w:val="0"/>
                 <w:sz w:val="18"/>
               </w:rPr>
-              <w:t>0.974</w:t>
+              <w:t>0.3388</w:t>
             </w:r>
           </w:p>
         </w:tc>
@@ -12325,7 +12580,7 @@
                 <w:b w:val="0"/>
                 <w:sz w:val="18"/>
               </w:rPr>
-              <w:t>0.633</w:t>
+              <w:t>0.1761</w:t>
             </w:r>
           </w:p>
         </w:tc>
@@ -12489,7 +12744,7 @@
                 <w:b w:val="0"/>
                 <w:sz w:val="18"/>
               </w:rPr>
-              <w:t>0.761</w:t>
+              <w:t>0.1989</w:t>
             </w:r>
           </w:p>
         </w:tc>
@@ -12653,7 +12908,7 @@
                 <w:b w:val="0"/>
                 <w:sz w:val="18"/>
               </w:rPr>
-              <w:t>0.853</w:t>
+              <w:t>0.1886</w:t>
             </w:r>
           </w:p>
         </w:tc>
@@ -12817,7 +13072,7 @@
                 <w:b w:val="0"/>
                 <w:sz w:val="18"/>
               </w:rPr>
-              <w:t>0.781</w:t>
+              <w:t>0.1900</w:t>
             </w:r>
           </w:p>
         </w:tc>
@@ -12981,7 +13236,7 @@
                 <w:b w:val="0"/>
                 <w:sz w:val="18"/>
               </w:rPr>
-              <w:t>0.812</w:t>
+              <w:t>0.1870</w:t>
             </w:r>
           </w:p>
         </w:tc>
@@ -13145,7 +13400,7 @@
                 <w:b w:val="0"/>
                 <w:sz w:val="18"/>
               </w:rPr>
-              <w:t>0.870</w:t>
+              <w:t>0.1843</w:t>
             </w:r>
           </w:p>
         </w:tc>
@@ -13309,7 +13564,7 @@
                 <w:b w:val="0"/>
                 <w:sz w:val="18"/>
               </w:rPr>
-              <w:t>0.687</w:t>
+              <w:t>0.1431</w:t>
             </w:r>
           </w:p>
         </w:tc>
@@ -13473,7 +13728,7 @@
                 <w:b w:val="0"/>
                 <w:sz w:val="18"/>
               </w:rPr>
-              <w:t>0.770</w:t>
+              <w:t>0.1625</w:t>
             </w:r>
           </w:p>
         </w:tc>
@@ -13637,7 +13892,7 @@
                 <w:b w:val="0"/>
                 <w:sz w:val="18"/>
               </w:rPr>
-              <w:t>0.769</w:t>
+              <w:t>0.1791</w:t>
             </w:r>
           </w:p>
         </w:tc>
@@ -13801,7 +14056,7 @@
                 <w:b w:val="0"/>
                 <w:sz w:val="18"/>
               </w:rPr>
-              <w:t>0.737</w:t>
+              <w:t>0.1535</w:t>
             </w:r>
           </w:p>
         </w:tc>
@@ -13965,7 +14220,7 @@
                 <w:b w:val="0"/>
                 <w:sz w:val="18"/>
               </w:rPr>
-              <w:t>0.728</w:t>
+              <w:t>0.1710</w:t>
             </w:r>
           </w:p>
         </w:tc>
@@ -14129,7 +14384,7 @@
                 <w:b w:val="0"/>
                 <w:sz w:val="18"/>
               </w:rPr>
-              <w:t>0.738</w:t>
+              <w:t>0.1850</w:t>
             </w:r>
           </w:p>
         </w:tc>
@@ -14293,7 +14548,7 @@
                 <w:b w:val="0"/>
                 <w:sz w:val="18"/>
               </w:rPr>
-              <w:t>0.751</w:t>
+              <w:t>0.1892</w:t>
             </w:r>
           </w:p>
         </w:tc>
@@ -14457,7 +14712,7 @@
                 <w:b w:val="0"/>
                 <w:sz w:val="18"/>
               </w:rPr>
-              <w:t>0.665</w:t>
+              <w:t>0.1921</w:t>
             </w:r>
           </w:p>
         </w:tc>
@@ -14621,7 +14876,7 @@
                 <w:b w:val="0"/>
                 <w:sz w:val="18"/>
               </w:rPr>
-              <w:t>0.762</w:t>
+              <w:t>0.1855</w:t>
             </w:r>
           </w:p>
         </w:tc>
@@ -14785,7 +15040,7 @@
                 <w:b w:val="0"/>
                 <w:sz w:val="18"/>
               </w:rPr>
-              <w:t>0.714</w:t>
+              <w:t>0.1799</w:t>
             </w:r>
           </w:p>
         </w:tc>
@@ -14949,7 +15204,7 @@
                 <w:b w:val="0"/>
                 <w:sz w:val="18"/>
               </w:rPr>
-              <w:t>0.796</w:t>
+              <w:t>0.1712</w:t>
             </w:r>
           </w:p>
         </w:tc>
@@ -15113,7 +15368,7 @@
                 <w:b w:val="0"/>
                 <w:sz w:val="18"/>
               </w:rPr>
-              <w:t>0.763</w:t>
+              <w:t>0.1752</w:t>
             </w:r>
           </w:p>
         </w:tc>
@@ -15277,7 +15532,7 @@
                 <w:b w:val="0"/>
                 <w:sz w:val="18"/>
               </w:rPr>
-              <w:t>0.662</w:t>
+              <w:t>0.1849</w:t>
             </w:r>
           </w:p>
         </w:tc>
@@ -15441,7 +15696,7 @@
                 <w:b w:val="0"/>
                 <w:sz w:val="18"/>
               </w:rPr>
-              <w:t>0.790</w:t>
+              <w:t>0.1861</w:t>
             </w:r>
           </w:p>
         </w:tc>
@@ -15643,7 +15898,7 @@
                 <w:b/>
                 <w:sz w:val="18"/>
               </w:rPr>
-              <w:t>CCP</w:t>
+              <w:t xml:space="preserve"> W_w</w:t>
             </w:r>
           </w:p>
         </w:tc>
@@ -15824,7 +16079,7 @@
                 <w:b w:val="0"/>
                 <w:sz w:val="18"/>
               </w:rPr>
-              <w:t>0.732</w:t>
+              <w:t>0.1894</w:t>
             </w:r>
           </w:p>
         </w:tc>
@@ -16005,7 +16260,7 @@
                 <w:b w:val="0"/>
                 <w:sz w:val="18"/>
               </w:rPr>
-              <w:t>0.773</w:t>
+              <w:t>0.1731</w:t>
             </w:r>
           </w:p>
         </w:tc>
@@ -16186,7 +16441,7 @@
                 <w:b w:val="0"/>
                 <w:sz w:val="18"/>
               </w:rPr>
-              <w:t>0.655</w:t>
+              <w:t>0.1753</w:t>
             </w:r>
           </w:p>
         </w:tc>
@@ -16367,7 +16622,7 @@
                 <w:b w:val="0"/>
                 <w:sz w:val="18"/>
               </w:rPr>
-              <w:t>0.659</w:t>
+              <w:t>0.1669</w:t>
             </w:r>
           </w:p>
         </w:tc>
@@ -16548,7 +16803,7 @@
                 <w:b w:val="0"/>
                 <w:sz w:val="18"/>
               </w:rPr>
-              <w:t>0.636</w:t>
+              <w:t>0.1710</w:t>
             </w:r>
           </w:p>
         </w:tc>
@@ -16729,7 +16984,7 @@
                 <w:b w:val="0"/>
                 <w:sz w:val="18"/>
               </w:rPr>
-              <w:t>0.678</w:t>
+              <w:t>0.1865</w:t>
             </w:r>
           </w:p>
         </w:tc>
@@ -16910,7 +17165,7 @@
                 <w:b w:val="0"/>
                 <w:sz w:val="18"/>
               </w:rPr>
-              <w:t>0.681</w:t>
+              <w:t>0.1843</w:t>
             </w:r>
           </w:p>
         </w:tc>
@@ -17092,7 +17347,7 @@
                 <w:b w:val="0"/>
                 <w:sz w:val="18"/>
               </w:rPr>
-              <w:t>0.664</w:t>
+              <w:t>0.1814</w:t>
             </w:r>
           </w:p>
         </w:tc>
@@ -17273,7 +17528,7 @@
                 <w:b w:val="0"/>
                 <w:sz w:val="18"/>
               </w:rPr>
-              <w:t>0.744</w:t>
+              <w:t>0.1861</w:t>
             </w:r>
           </w:p>
         </w:tc>
@@ -17454,7 +17709,7 @@
                 <w:b w:val="0"/>
                 <w:sz w:val="18"/>
               </w:rPr>
-              <w:t>0.705</w:t>
+              <w:t>0.2060</w:t>
             </w:r>
           </w:p>
         </w:tc>
@@ -17635,7 +17890,7 @@
                 <w:b w:val="0"/>
                 <w:sz w:val="18"/>
               </w:rPr>
-              <w:t>0.600</w:t>
+              <w:t>0.1966</w:t>
             </w:r>
           </w:p>
         </w:tc>
@@ -17816,7 +18071,7 @@
                 <w:b w:val="0"/>
                 <w:sz w:val="18"/>
               </w:rPr>
-              <w:t>0.718</w:t>
+              <w:t>0.2030</w:t>
             </w:r>
           </w:p>
         </w:tc>
@@ -17997,7 +18252,7 @@
                 <w:b w:val="0"/>
                 <w:sz w:val="18"/>
               </w:rPr>
-              <w:t>0.603</w:t>
+              <w:t>0.2168</w:t>
             </w:r>
           </w:p>
         </w:tc>
@@ -18178,7 +18433,7 @@
                 <w:b w:val="0"/>
                 <w:sz w:val="18"/>
               </w:rPr>
-              <w:t>0.596</w:t>
+              <w:t>0.2205</w:t>
             </w:r>
           </w:p>
         </w:tc>
@@ -18359,7 +18614,7 @@
                 <w:b w:val="0"/>
                 <w:sz w:val="18"/>
               </w:rPr>
-              <w:t>0.598</w:t>
+              <w:t>0.2128</w:t>
             </w:r>
           </w:p>
         </w:tc>
@@ -18540,7 +18795,7 @@
                 <w:b w:val="0"/>
                 <w:sz w:val="18"/>
               </w:rPr>
-              <w:t>0.616</w:t>
+              <w:t>0.2117</w:t>
             </w:r>
           </w:p>
         </w:tc>
@@ -18721,7 +18976,7 @@
                 <w:b w:val="0"/>
                 <w:sz w:val="18"/>
               </w:rPr>
-              <w:t>0.613</w:t>
+              <w:t>0.2060</w:t>
             </w:r>
           </w:p>
         </w:tc>
@@ -18902,7 +19157,7 @@
                 <w:b w:val="0"/>
                 <w:sz w:val="18"/>
               </w:rPr>
-              <w:t>0.598</w:t>
+              <w:t>0.2012</w:t>
             </w:r>
           </w:p>
         </w:tc>
@@ -19083,7 +19338,7 @@
                 <w:b w:val="0"/>
                 <w:sz w:val="18"/>
               </w:rPr>
-              <w:t>0.620</w:t>
+              <w:t>0.2059</w:t>
             </w:r>
           </w:p>
         </w:tc>
@@ -19264,7 +19519,7 @@
                 <w:b w:val="0"/>
                 <w:sz w:val="18"/>
               </w:rPr>
-              <w:t>0.573</w:t>
+              <w:t>0.2057</w:t>
             </w:r>
           </w:p>
         </w:tc>
@@ -19445,7 +19700,7 @@
                 <w:b w:val="0"/>
                 <w:sz w:val="18"/>
               </w:rPr>
-              <w:t>0.555</w:t>
+              <w:t>0.2035</w:t>
             </w:r>
           </w:p>
         </w:tc>
@@ -19626,7 +19881,7 @@
                 <w:b w:val="0"/>
                 <w:sz w:val="18"/>
               </w:rPr>
-              <w:t>0.653</w:t>
+              <w:t>0.2063</w:t>
             </w:r>
           </w:p>
         </w:tc>
@@ -19807,7 +20062,7 @@
                 <w:b w:val="0"/>
                 <w:sz w:val="18"/>
               </w:rPr>
-              <w:t>0.589</w:t>
+              <w:t>0.2062</w:t>
             </w:r>
           </w:p>
         </w:tc>
@@ -19988,7 +20243,7 @@
                 <w:b w:val="0"/>
                 <w:sz w:val="18"/>
               </w:rPr>
-              <w:t>0.581</w:t>
+              <w:t>0.2063</w:t>
             </w:r>
           </w:p>
         </w:tc>
@@ -20169,7 +20424,7 @@
                 <w:b w:val="0"/>
                 <w:sz w:val="18"/>
               </w:rPr>
-              <w:t>0.694</w:t>
+              <w:t>0.2102</w:t>
             </w:r>
           </w:p>
         </w:tc>
@@ -20350,7 +20605,7 @@
                 <w:b w:val="0"/>
                 <w:sz w:val="18"/>
               </w:rPr>
-              <w:t>0.811</w:t>
+              <w:t>0.2031</w:t>
             </w:r>
           </w:p>
         </w:tc>
@@ -20531,7 +20786,7 @@
                 <w:b w:val="0"/>
                 <w:sz w:val="18"/>
               </w:rPr>
-              <w:t>0.667</w:t>
+              <w:t>0.2012</w:t>
             </w:r>
           </w:p>
         </w:tc>
@@ -20712,7 +20967,7 @@
                 <w:b w:val="0"/>
                 <w:sz w:val="18"/>
               </w:rPr>
-              <w:t>0.654</w:t>
+              <w:t>0.2058</w:t>
             </w:r>
           </w:p>
         </w:tc>
@@ -20893,7 +21148,7 @@
                 <w:b w:val="0"/>
                 <w:sz w:val="18"/>
               </w:rPr>
-              <w:t>0.628</w:t>
+              <w:t>0.2101</w:t>
             </w:r>
           </w:p>
         </w:tc>
@@ -21074,7 +21329,7 @@
                 <w:b w:val="0"/>
                 <w:sz w:val="18"/>
               </w:rPr>
-              <w:t>0.565</w:t>
+              <w:t>0.2126</w:t>
             </w:r>
           </w:p>
         </w:tc>
@@ -21255,7 +21510,7 @@
                 <w:b w:val="0"/>
                 <w:sz w:val="18"/>
               </w:rPr>
-              <w:t>0.834</w:t>
+              <w:t>0.2568</w:t>
             </w:r>
           </w:p>
         </w:tc>
@@ -21436,7 +21691,7 @@
                 <w:b w:val="0"/>
                 <w:sz w:val="18"/>
               </w:rPr>
-              <w:t>0.676</w:t>
+              <w:t>0.1724</w:t>
             </w:r>
           </w:p>
         </w:tc>
@@ -21617,7 +21872,7 @@
                 <w:b w:val="0"/>
                 <w:sz w:val="18"/>
               </w:rPr>
-              <w:t>0.677</w:t>
+              <w:t>0.2283</w:t>
             </w:r>
           </w:p>
         </w:tc>
@@ -21798,7 +22053,7 @@
                 <w:b w:val="0"/>
                 <w:sz w:val="18"/>
               </w:rPr>
-              <w:t>0.693</w:t>
+              <w:t>0.2051</w:t>
             </w:r>
           </w:p>
         </w:tc>
@@ -21979,7 +22234,7 @@
                 <w:b w:val="0"/>
                 <w:sz w:val="18"/>
               </w:rPr>
-              <w:t>0.672</w:t>
+              <w:t>0.2218</w:t>
             </w:r>
           </w:p>
         </w:tc>

</xml_diff>